<commit_message>
Remove preparer identity; convert to pro se taxpayer response
Remove Isabel Raimundo's name, PTIN (P02482553), and firm name
(Advance Tax Services Accountants Inc) from all 8 documents.
All documents now present Eliana Machado de Almeida as responding
to IRS Letter 566-T directly (pro se), in first-person voice.
Regenerated all 4 .docx files from updated markdown sources.

https://claude.ai/code/session_01S7BkMMTVRhChbDiN6thvVk
</commit_message>
<xml_diff>
--- a/AUDIT_DEFENSE_PACKAGE.docx
+++ b/AUDIT_DEFENSE_PACKAGE.docx
@@ -35,7 +35,7 @@
         <w:t xml:space="preserve"> </w:t>
       </w:r>
       <w:r>
-        <w:t xml:space="preserve">Advance Tax Services Accountants Inc — Isabel Raimundo, EA (PTIN P02482553)</w:t>
+        <w:t xml:space="preserve">Eliana Machado de Almeida, Pro Se</w:t>
       </w:r>
       <w:r>
         <w:t xml:space="preserve"> </w:t>
@@ -7746,29 +7746,12 @@
         <w:t xml:space="preserve"> </w:t>
       </w:r>
       <w:r>
-        <w:rPr>
-          <w:bCs/>
-          <w:b/>
-        </w:rPr>
-        <w:t xml:space="preserve">Authorized Representative:</w:t>
-      </w:r>
-      <w:r>
-        <w:t xml:space="preserve"> </w:t>
-      </w:r>
-      <w:r>
-        <w:t xml:space="preserve">Isabel Raimundo, EA — PTIN P02482553</w:t>
-      </w:r>
-    </w:p>
-    <w:p>
-      <w:r>
-        <w:pict>
-          <v:rect style="width:0;height:1.5pt" o:hralign="center" o:hrstd="t" o:hr="t"/>
-        </w:pict>
-      </w:r>
-    </w:p>
-    <w:p>
-      <w:pPr>
-        <w:pStyle w:val="FirstParagraph"/>
+        <w:t xml:space="preserve">—</w:t>
+      </w:r>
+    </w:p>
+    <w:p>
+      <w:pPr>
+        <w:pStyle w:val="BodyText"/>
       </w:pPr>
       <w:r>
         <w:t xml:space="preserve">Dear Tax Examiner (ID #0361000000):</w:t>
@@ -7779,7 +7762,7 @@
         <w:pStyle w:val="BodyText"/>
       </w:pPr>
       <w:r>
-        <w:t xml:space="preserve">This office submits the following response to IRS Letter 566-T dated May 18, 2026, received on behalf of our client, Ms. Eliana Machado de Almeida. The examination concerns the Schedule A mortgage interest deduction of $114,034 claimed on the 2024 Form 1040. We have conducted a thorough and independent review of all source documents, including both Forms 1098, the AmWest Loan Activity Report, the Closing Disclosure, the Mortgage Note, and the underlying Drake tax software data entry records. The reconciliation is fully resolved. Our findings, concessions, and supporting documentation are set forth herein.</w:t>
+        <w:t xml:space="preserve">I, Eliana Machado de Almeida, submit the following response to IRS Letter 566-T dated May 18, 2026. The examination concerns the Schedule A mortgage interest deduction of $114,034 claimed on my 2024 Form 1040. I have conducted a thorough review of all source documents, including both Forms 1098, the AmWest Loan Activity Report, the Closing Disclosure, the Mortgage Note, and my tax return records. The reconciliation is fully resolved. My findings, concessions, and supporting documentation are set forth herein.</w:t>
       </w:r>
     </w:p>
     <w:p>
@@ -7806,7 +7789,7 @@
         <w:pStyle w:val="BodyText"/>
       </w:pPr>
       <w:r>
-        <w:t xml:space="preserve">At the outset, we wish to address directly the nature and origin of the discrepancy that prompted this examination.</w:t>
+        <w:t xml:space="preserve">At the outset, I wish to address directly the nature and origin of the discrepancy that prompted this examination.</w:t>
       </w:r>
     </w:p>
     <w:p>
@@ -7814,7 +7797,7 @@
         <w:pStyle w:val="BodyText"/>
       </w:pPr>
       <w:r>
-        <w:t xml:space="preserve">Ms. Machado de Almeida reported every item of income and every deduction on her 2024 return in good faith, based upon documents provided by her institutional lenders. The $114,034 claimed on Schedule A, Line 8a corresponds precisely to actual amounts reflected on Forms 1098 issued by AmWest Funding Corp and Radius Financial Group — two regulated mortgage lenders. No figure was fabricated, estimated, or inflated. Every dollar claimed traces directly to a documented payment.</w:t>
+        <w:t xml:space="preserve">I reported every item of income and every deduction on my 2024 return in good faith, based upon documents provided by my institutional lenders. The $114,034 claimed on Schedule A, Line 8a corresponds precisely to actual amounts reflected on Forms 1098 issued by AmWest Funding Corp and Radius Financial Group — two regulated mortgage lenders. No figure was fabricated, estimated, or inflated. Every dollar claimed traces directly to a documented payment.</w:t>
       </w:r>
     </w:p>
     <w:p>
@@ -7838,7 +7821,7 @@
         <w:t xml:space="preserve"> </w:t>
       </w:r>
       <w:r>
-        <w:t xml:space="preserve">from Schedule A — a circumstance that understated the taxpayer’s deduction by $1,870. Had Ms. Machado de Almeida been motivated to claim the largest possible deduction, this amount would not have been omitted. We disclose this omission voluntarily and in full, consistent with our obligation under Circular 230 and our client’s commitment to accuracy.</w:t>
+        <w:t xml:space="preserve">from Schedule A — a circumstance that understated my deduction by $1,870. Had I been motivated to claim the largest possible deduction, this amount would not have been omitted. I disclose this omission voluntarily and in full, consistent with my commitment to accuracy.</w:t>
       </w:r>
     </w:p>
     <w:p>
@@ -7846,7 +7829,7 @@
         <w:pStyle w:val="BodyText"/>
       </w:pPr>
       <w:r>
-        <w:t xml:space="preserve">The overstatement identified herein arises entirely from two technical preparer errors involving complex post-TCJA provisions: (1) the failure to complete Form 14900 and apply the IRC §163(h)(3)(B) $750,000 loan limit, and (2) the treatment of refinance points as immediately deductible rather than subject to ratable amortization under IRC §461(g)(2). These are errors of law and procedure on the part of the return preparer. They are not errors of fact, and they do not reflect any intent on the part of the taxpayer to obtain a deduction to which she is not entitled.</w:t>
+        <w:t xml:space="preserve">The overstatement identified herein arises entirely from two technical errors involving complex post-TCJA provisions: (1) the failure to complete Form 14900 and apply the IRC §163(h)(3)(B) $750,000 loan limit, and (2) the treatment of refinance points as immediately deductible rather than subject to ratable amortization under IRC §461(g)(2). These are errors of law and procedure on the preparation of the return. They are not errors of fact, and they do not reflect any intent on my part to obtain a deduction to which I am not entitled.</w:t>
       </w:r>
     </w:p>
     <w:p>
@@ -7854,7 +7837,7 @@
         <w:pStyle w:val="BodyText"/>
       </w:pPr>
       <w:r>
-        <w:t xml:space="preserve">Ms. Machado de Almeida is a self-employed individual who reported her Schedule C net profit of $81,379 in full, paid self-employment tax accordingly, and maintained complete records of her mortgage transactions. She cooperated fully and immediately with our review and authorized the voluntary concession set forth in this response.</w:t>
+        <w:t xml:space="preserve">I am a self-employed individual who reported my Schedule C net profit of $81,379 in full, paid self-employment tax accordingly, and maintained complete records of my mortgage transactions. I offer the voluntary concession set forth in this response.</w:t>
       </w:r>
     </w:p>
     <w:p>
@@ -8134,7 +8117,7 @@
         <w:pStyle w:val="BodyText"/>
       </w:pPr>
       <w:r>
-        <w:t xml:space="preserve">We enclose the Loan Activity Report (Exhibit 6) and the AmWest Form 1098 (Exhibit 4) for the Examiner’s review.</w:t>
+        <w:t xml:space="preserve">I enclose the Loan Activity Report (Exhibit 6) and the AmWest Form 1098 (Exhibit 4) for the Examiner’s review.</w:t>
       </w:r>
     </w:p>
     <w:p>
@@ -8587,7 +8570,7 @@
         <w:pStyle w:val="BodyText"/>
       </w:pPr>
       <w:r>
-        <w:t xml:space="preserve">After careful and thorough review, we respectfully concede the overstatement of the home mortgage interest deduction and present the correct figures below.</w:t>
+        <w:t xml:space="preserve">After careful and thorough review, I respectfully concede the overstatement of the home mortgage interest deduction and present the correct figures below.</w:t>
       </w:r>
     </w:p>
     <w:tbl>
@@ -8870,7 +8853,7 @@
         <w:pStyle w:val="BodyText"/>
       </w:pPr>
       <w:r>
-        <w:t xml:space="preserve">We further note that the reduction in itemized deductions will increase the taxpayer’s Qualified Business Income Deduction under IRC §199A from $5,196 to approximately $12,508, partially offsetting the tax impact. The net additional taxable income is approximately $29,246, and the estimated additional income tax is approximately $3,510. Exact figures will be reflected on Form 1040-X.</w:t>
+        <w:t xml:space="preserve">I further note that the reduction in itemized deductions will increase my Qualified Business Income Deduction under IRC §199A from $5,196 to approximately $12,508, partially offsetting the tax impact. The net additional taxable income is approximately $29,246, and the estimated additional income tax is approximately $3,510. Exact figures will be reflected on Form 1040-X.</w:t>
       </w:r>
     </w:p>
     <w:p>
@@ -8878,7 +8861,7 @@
         <w:pStyle w:val="BodyText"/>
       </w:pPr>
       <w:r>
-        <w:t xml:space="preserve">We are prepared to file Form 1040-X to reflect all corrections. In the interest of an orderly and efficient resolution, we respectfully request that the Examiner advise whether processing through the correspondence examination is preferred, or whether a formal amended return filed under separate cover is required prior to the issuance of any proposed adjustment.</w:t>
+        <w:t xml:space="preserve">I am prepared to file Form 1040-X to reflect all corrections. In the interest of an orderly and efficient resolution, I respectfully request that the Examiner advise whether processing through the correspondence examination is preferred, or whether a formal amended return filed under separate cover is required prior to the issuance of any proposed adjustment.</w:t>
       </w:r>
     </w:p>
     <w:p>
@@ -8913,37 +8896,19 @@
           <w:bCs/>
           <w:b/>
         </w:rPr>
-        <w:t xml:space="preserve">Isabel Raimundo, EA</w:t>
-      </w:r>
-      <w:r>
-        <w:t xml:space="preserve"> </w:t>
-      </w:r>
-      <w:r>
-        <w:t xml:space="preserve">PTIN: P02482553</w:t>
-      </w:r>
-      <w:r>
-        <w:t xml:space="preserve"> </w:t>
-      </w:r>
-      <w:r>
-        <w:t xml:space="preserve">Advance Tax Services Accountants Inc</w:t>
-      </w:r>
-      <w:r>
-        <w:t xml:space="preserve"> </w:t>
-      </w:r>
-      <w:r>
-        <w:t xml:space="preserve">4 Mount Royal Ave, Suite 4-110F</w:t>
-      </w:r>
-      <w:r>
-        <w:t xml:space="preserve"> </w:t>
-      </w:r>
-      <w:r>
-        <w:t xml:space="preserve">Marlborough, MA 01752</w:t>
-      </w:r>
-      <w:r>
-        <w:t xml:space="preserve"> </w:t>
-      </w:r>
-      <w:r>
-        <w:t xml:space="preserve">Telephone: 781-759-2202</w:t>
+        <w:t xml:space="preserve">Eliana Machado de Almeida</w:t>
+      </w:r>
+      <w:r>
+        <w:t xml:space="preserve"> </w:t>
+      </w:r>
+      <w:r>
+        <w:t xml:space="preserve">7 Briarwood Drive</w:t>
+      </w:r>
+      <w:r>
+        <w:t xml:space="preserve"> </w:t>
+      </w:r>
+      <w:r>
+        <w:t xml:space="preserve">Edgartown, MA 02539</w:t>
       </w:r>
     </w:p>
     <w:p>
@@ -9105,7 +9070,7 @@
         <w:t xml:space="preserve"> </w:t>
       </w:r>
       <w:r>
-        <w:t xml:space="preserve">Isabel Raimundo, EA — Advance Tax Services Accountants Inc</w:t>
+        <w:t xml:space="preserve">Eliana Machado de Almeida, Pro Se</w:t>
       </w:r>
       <w:r>
         <w:t xml:space="preserve"> </w:t>
@@ -9121,23 +9086,7 @@
         <w:t xml:space="preserve"> </w:t>
       </w:r>
       <w:r>
-        <w:t xml:space="preserve">781-759-2202 |</w:t>
-      </w:r>
-      <w:r>
-        <w:t xml:space="preserve"> </w:t>
-      </w:r>
-      <w:r>
-        <w:rPr>
-          <w:bCs/>
-          <w:b/>
-        </w:rPr>
-        <w:t xml:space="preserve">Best time:</w:t>
-      </w:r>
-      <w:r>
-        <w:t xml:space="preserve"> </w:t>
-      </w:r>
-      <w:r>
-        <w:t xml:space="preserve">Monday–Friday, 9:00 a.m. – 5:00 p.m. ET</w:t>
+        <w:t xml:space="preserve">[on file with IRS]</w:t>
       </w:r>
     </w:p>
     <w:p>
@@ -9164,7 +9113,7 @@
         <w:pStyle w:val="BodyText"/>
       </w:pPr>
       <w:r>
-        <w:t xml:space="preserve">We submit the following complete response to Letter 566-T (Schedule A — Home Mortgage Interest and Points, $114,034) for the 2024 tax year of Eliana Machado de Almeida. All issues have been identified, analyzed, and resolved in full. A voluntary concession is offered.</w:t>
+        <w:t xml:space="preserve">I submit the following complete response to Letter 566-T (Schedule A — Home Mortgage Interest and Points, $114,034) for my 2024 tax year. All issues have been identified, analyzed, and resolved in full. A voluntary concession is offered.</w:t>
       </w:r>
     </w:p>
     <w:p>
@@ -9191,7 +9140,7 @@
         <w:pStyle w:val="BodyText"/>
       </w:pPr>
       <w:r>
-        <w:t xml:space="preserve">The taxpayer, Ms. Machado de Almeida, reported mortgage interest based entirely upon Forms 1098 issued by two regulated institutional lenders: AmWest Funding Corp and Radius Financial Group. Every dollar claimed on Schedule A traces directly to a lender-issued document. At no point did the taxpayer estimate, fabricate, or inflate any figure. The errors identified herein are exclusively technical preparer errors involving complex provisions of the Tax Cuts and Jobs Act of 2017.</w:t>
+        <w:t xml:space="preserve">I reported mortgage interest based entirely upon Forms 1098 issued by two regulated institutional lenders: AmWest Funding Corp and Radius Financial Group. Every dollar claimed on Schedule A traces directly to a lender-issued document. At no point did I estimate, fabricate, or inflate any figure. The errors identified herein involve complex provisions of the Tax Cuts and Jobs Act of 2017.</w:t>
       </w:r>
     </w:p>
     <w:p>
@@ -9199,7 +9148,7 @@
         <w:pStyle w:val="BodyText"/>
       </w:pPr>
       <w:r>
-        <w:t xml:space="preserve">We further note that a secondary preparer error caused the Radius interest of $1,869.86 to be</w:t>
+        <w:t xml:space="preserve">I further note that a secondary error caused the Radius interest of $1,869.86 to be</w:t>
       </w:r>
       <w:r>
         <w:t xml:space="preserve"> </w:t>
@@ -9215,7 +9164,7 @@
         <w:t xml:space="preserve"> </w:t>
       </w:r>
       <w:r>
-        <w:t xml:space="preserve">from Schedule A — reducing the claimed deduction below its correct amount by $1,870. This outcome is inconsistent with any intent to over-claim and is being disclosed voluntarily.</w:t>
+        <w:t xml:space="preserve">from Schedule A — reducing my claimed deduction below its correct amount by $1,870. This outcome is inconsistent with any intent to over-claim and is being disclosed voluntarily.</w:t>
       </w:r>
     </w:p>
     <w:p>
@@ -9469,7 +9418,7 @@
         <w:pStyle w:val="BodyText"/>
       </w:pPr>
       <w:r>
-        <w:t xml:space="preserve">We respectfully concede that the correct Schedule A mortgage deduction for 2024 is</w:t>
+        <w:t xml:space="preserve">I respectfully concede that the correct Schedule A mortgage deduction for 2024 is</w:t>
       </w:r>
       <w:r>
         <w:t xml:space="preserve"> </w:t>
@@ -9506,7 +9455,7 @@
         <w:pStyle w:val="BodyText"/>
       </w:pPr>
       <w:r>
-        <w:t xml:space="preserve">As a result of this reduction, the taxpayer’s Qualified Business Income Deduction under IRC §199A increases from $5,196 to approximately $12,508. The net additional taxable income, after the QBID offset, is approximately $29,246. We are prepared to file Form 1040-X to reflect all corrections.</w:t>
+        <w:t xml:space="preserve">As a result of this reduction, my Qualified Business Income Deduction under IRC §199A increases from $5,196 to approximately $12,508. The net additional taxable income, after the QBID offset, is approximately $29,246. I am prepared to file Form 1040-X to reflect all corrections.</w:t>
       </w:r>
     </w:p>
     <w:p>
@@ -11730,17 +11679,7 @@
           <w:iCs/>
           <w:i/>
         </w:rPr>
-        <w:t xml:space="preserve">Advance Tax Services Accountants Inc | Isabel Raimundo, EA | PTIN P02482553</w:t>
-      </w:r>
-      <w:r>
-        <w:t xml:space="preserve"> </w:t>
-      </w:r>
-      <w:r>
-        <w:rPr>
-          <w:iCs/>
-          <w:i/>
-        </w:rPr>
-        <w:t xml:space="preserve">4 Mount Royal Ave, Suite 4-110F, Marlborough MA 01752 | Tel: 781-759-2202</w:t>
+        <w:t xml:space="preserve">Eliana Machado de Almeida | Pro Se | 7 Briarwood Drive, Edgartown MA 02539</w:t>
       </w:r>
     </w:p>
     <w:bookmarkEnd w:id="67"/>

</xml_diff>

<commit_message>
Reframe all documents as taxpayer's own misunderstanding, not preparer error
Remove all references to preparer errors and reframe the discrepancies
as the taxpayer's misunderstanding of the post-TCJA mortgage interest
deduction limit. Key changes across all 8 documents (4 md + 4 docx):
- "Preparer Errors Identified" → "Discrepancies Identified"
- "technical preparer errors" → "misunderstanding of the deduction limit"
- "The preparer combined..." → "My return combined..."
- "errors of law and procedure on the preparation of the return" →
  "misunderstandings of law and procedure"
- All third-person Eliana references in Drake file → first person
- "We have now completed Form 14900" → "I have now completed"
- Cover letter quote: "We are enclosing" → "I am enclosing"

https://claude.ai/code/session_01S7BkMMTVRhChbDiN6thvVk
</commit_message>
<xml_diff>
--- a/AUDIT_DEFENSE_PACKAGE.docx
+++ b/AUDIT_DEFENSE_PACKAGE.docx
@@ -363,7 +363,7 @@
         <w:pStyle w:val="BodyText"/>
       </w:pPr>
       <w:r>
-        <w:t xml:space="preserve">The taxpayer, Ms. Eliana Machado de Almeida, purchased her primary residence at 4 Laura’s Way, Edgartown, MA 02539, in October 2023 and refinanced the mortgage in November 2024. Both transactions are fully documented by institutional lenders. The deduction as filed reflects actual amounts paid to those lenders; the overstatement results entirely from technical preparer errors, as described below.</w:t>
+        <w:t xml:space="preserve">The taxpayer, Ms. Eliana Machado de Almeida, purchased her primary residence at 4 Laura’s Way, Edgartown, MA 02539, in October 2023 and refinanced the mortgage in November 2024. Both transactions are fully documented by institutional lenders. The deduction as filed reflects actual amounts paid to those lenders; the overstatement results from a misunderstanding of the post-TCJA mortgage interest deduction limit, as explained below.</w:t>
       </w:r>
     </w:p>
     <w:p>
@@ -938,7 +938,7 @@
         <w:t xml:space="preserve"> </w:t>
       </w:r>
       <w:r>
-        <w:t xml:space="preserve">The preparer included AmWest interest and Radius points but did not carry the Radius interest to Schedule A line 8a. This is a preparer data-entry omission that, notably, understates the deduction by $1,870 — an outcome entirely inconsistent with any intent to overclaim.</w:t>
+        <w:t xml:space="preserve">My return included AmWest interest and Radius points but did not carry the Radius interest to Schedule A line 8a. This omission, notably, understates my deduction by $1,870 — an outcome entirely inconsistent with any intent to overclaim.</w:t>
       </w:r>
     </w:p>
     <w:p>
@@ -949,13 +949,13 @@
       </w:r>
     </w:p>
     <w:bookmarkEnd w:id="25"/>
-    <w:bookmarkStart w:id="26" w:name="preparer-errors-identified"/>
+    <w:bookmarkStart w:id="26" w:name="discrepancies-identified"/>
     <w:p>
       <w:pPr>
         <w:pStyle w:val="Heading3"/>
       </w:pPr>
       <w:r>
-        <w:t xml:space="preserve">Preparer Errors Identified</w:t>
+        <w:t xml:space="preserve">Discrepancies Identified</w:t>
       </w:r>
     </w:p>
     <w:tbl>
@@ -1024,19 +1024,19 @@
                 <w:bCs/>
                 <w:b/>
               </w:rPr>
-              <w:t xml:space="preserve">Error 1 (Primary)</w:t>
-            </w:r>
-          </w:p>
-        </w:tc>
-        <w:tc>
-          <w:tcPr/>
-          <w:p>
-            <w:pPr>
-              <w:pStyle w:val="Compact"/>
-              <w:jc w:val="left"/>
-            </w:pPr>
-            <w:r>
-              <w:t xml:space="preserve">IRC §163(h)(3)(B) $750,000 loan limit not applied. Drake’s mortgage interest limitation worksheet was left blank. Both mortgages are post-TCJA (originated after 12/15/2017).</w:t>
+              <w:t xml:space="preserve">Item 1 (Primary)</w:t>
+            </w:r>
+          </w:p>
+        </w:tc>
+        <w:tc>
+          <w:tcPr/>
+          <w:p>
+            <w:pPr>
+              <w:pStyle w:val="Compact"/>
+              <w:jc w:val="left"/>
+            </w:pPr>
+            <w:r>
+              <w:t xml:space="preserve">IRC §163(h)(3)(B) $750,000 loan limit not applied. The mortgage interest limitation worksheet was left blank. Both mortgages are post-TCJA (originated after 12/15/2017).</w:t>
             </w:r>
           </w:p>
         </w:tc>
@@ -1066,7 +1066,7 @@
                 <w:bCs/>
                 <w:b/>
               </w:rPr>
-              <w:t xml:space="preserve">Error 2 (Primary)</w:t>
+              <w:t xml:space="preserve">Item 2 (Primary)</w:t>
             </w:r>
           </w:p>
         </w:tc>
@@ -1108,7 +1108,7 @@
                 <w:bCs/>
                 <w:b/>
               </w:rPr>
-              <w:t xml:space="preserve">Error 3 (Secondary)</w:t>
+              <w:t xml:space="preserve">Item 3 (Secondary)</w:t>
             </w:r>
           </w:p>
         </w:tc>
@@ -1143,7 +1143,7 @@
         <w:pStyle w:val="BodyText"/>
       </w:pPr>
       <w:r>
-        <w:t xml:space="preserve">All three errors are exclusively preparer errors. The taxpayer supplied accurate Forms 1098 from both institutional lenders, maintained all supporting records, and cooperated fully with this review. At no point did the taxpayer fabricate, inflate, or selectively report any figure.</w:t>
+        <w:t xml:space="preserve">All figures were taken directly from Forms 1098 issued by two regulated institutional lenders. At no point was any figure fabricated, estimated, or inflated.</w:t>
       </w:r>
     </w:p>
     <w:p>
@@ -3430,13 +3430,13 @@
       </w:tr>
     </w:tbl>
     <w:bookmarkEnd w:id="33"/>
-    <w:bookmarkStart w:id="34" w:name="Xe305b581d8f7172ed7e771969640e383497aa22"/>
+    <w:bookmarkStart w:id="34" w:name="step-2-what-was-reported-on-schedule-a"/>
     <w:p>
       <w:pPr>
         <w:pStyle w:val="Heading3"/>
       </w:pPr>
       <w:r>
-        <w:t xml:space="preserve">Step 2: What the Preparer Entered on Schedule A</w:t>
+        <w:t xml:space="preserve">Step 2: What Was Reported on Schedule A</w:t>
       </w:r>
     </w:p>
     <w:tbl>
@@ -3850,7 +3850,7 @@
         <w:t xml:space="preserve"> </w:t>
       </w:r>
       <w:r>
-        <w:t xml:space="preserve">The preparer combined AmWest interest ($95,134) and Radius points ($18,900) on Schedule A line 8a, inadvertently omitting the Radius interest of $1,869.86. This omission of $1,870 partially offsets the overstatement from the unapplied loan limit.</w:t>
+        <w:t xml:space="preserve">My return combined AmWest interest ($95,134) and Radius points ($18,900) on Schedule A line 8a, inadvertently omitting the Radius interest of $1,869.86. This omission of $1,870 partially offsets the overstatement from the unapplied loan limit.</w:t>
       </w:r>
     </w:p>
     <w:bookmarkEnd w:id="35"/>
@@ -6221,13 +6221,13 @@
     <w:tbl>
       <w:tblPr>
         <w:tblStyle w:val="Table"/>
-        <w:tblW w:type="pct" w:w="5000"/>
+        <w:tblW w:type="auto" w:w="0"/>
         <w:tblLook w:firstRow="1" w:lastRow="0" w:firstColumn="0" w:lastColumn="0" w:noHBand="0" w:noVBand="0" w:val="0020"/>
         <w:jc w:val="start"/>
       </w:tblPr>
       <w:tblGrid>
-        <w:gridCol w:w="2640"/>
-        <w:gridCol w:w="5280"/>
+        <w:gridCol w:w="3960"/>
+        <w:gridCol w:w="3960"/>
       </w:tblGrid>
       <w:tr>
         <w:trPr>
@@ -6267,7 +6267,7 @@
               <w:jc w:val="left"/>
             </w:pPr>
             <w:r>
-              <w:t xml:space="preserve">Preparer (as filed)</w:t>
+              <w:t xml:space="preserve">As filed</w:t>
             </w:r>
           </w:p>
         </w:tc>
@@ -7829,7 +7829,7 @@
         <w:pStyle w:val="BodyText"/>
       </w:pPr>
       <w:r>
-        <w:t xml:space="preserve">The overstatement identified herein arises entirely from two technical errors involving complex post-TCJA provisions: (1) the failure to complete Form 14900 and apply the IRC §163(h)(3)(B) $750,000 loan limit, and (2) the treatment of refinance points as immediately deductible rather than subject to ratable amortization under IRC §461(g)(2). These are errors of law and procedure on the preparation of the return. They are not errors of fact, and they do not reflect any intent on my part to obtain a deduction to which I am not entitled.</w:t>
+        <w:t xml:space="preserve">The overstatement identified herein arises from two technical misunderstandings of complex post-TCJA provisions: (1) I did not apply the IRC §163(h)(3)(B) $750,000 qualified loan limit to post-2017 home acquisition debt, and (2) the Radius refinance points were treated as fully deductible in 2024 rather than amortized ratably under IRC §461(g)(2). These are misunderstandings of law and procedure, not misrepresentations of fact, and they do not reflect any intent to obtain a deduction to which I am not entitled.</w:t>
       </w:r>
     </w:p>
     <w:p>
@@ -8266,7 +8266,7 @@
         <w:pStyle w:val="BodyText"/>
       </w:pPr>
       <w:r>
-        <w:t xml:space="preserve">We have now completed Form 14900 in its entirety (enclosed as Exhibit 11), using the average-balance methodology prescribed by IRS Publication 936:</w:t>
+        <w:t xml:space="preserve">I have now completed Form 14900 in its entirety (enclosed as Exhibit 11), using the average-balance methodology prescribed by IRS Publication 936:</w:t>
       </w:r>
     </w:p>
     <w:tbl>

</xml_diff>